<commit_message>
Adding Final Word Document
Adding the final version of the Word document for assignment 3.2 in CSD 340 for Wade Eckert on 4/1/26.
</commit_message>
<xml_diff>
--- a/module-3/eckert-assignment3_2.docx
+++ b/module-3/eckert-assignment3_2.docx
@@ -222,9 +222,7 @@
         <w:spacing w:line="480" w:lineRule="auto"/>
         <w:jc w:val="center"/>
         <w:rPr>
-          <w:rFonts w:ascii="Times New Roman" w:hAnsi="Times New Roman" w:cs="Times New Roman"/>
-          <w:sz w:val="24"/>
-          <w:szCs w:val="24"/>
+          <w:rStyle w:val="Hyperlink"/>
         </w:rPr>
       </w:pPr>
       <w:r>
@@ -265,11 +263,15 @@
         <w:spacing w:line="480" w:lineRule="auto"/>
         <w:jc w:val="center"/>
         <w:rPr>
-          <w:rFonts w:ascii="Times New Roman" w:hAnsi="Times New Roman" w:cs="Times New Roman"/>
-          <w:sz w:val="24"/>
-          <w:szCs w:val="24"/>
-        </w:rPr>
-      </w:pPr>
+          <w:rStyle w:val="Hyperlink"/>
+        </w:rPr>
+      </w:pPr>
+      <w:r>
+        <w:rPr>
+          <w:rStyle w:val="Hyperlink"/>
+        </w:rPr>
+        <w:t>https://wadeeckert.github.io/CSD-340/</w:t>
+      </w:r>
     </w:p>
     <w:p>
       <w:pPr>
@@ -335,6 +337,8 @@
           <w:szCs w:val="24"/>
         </w:rPr>
       </w:pPr>
+      <w:bookmarkStart w:id="0" w:name="_GoBack"/>
+      <w:bookmarkEnd w:id="0"/>
     </w:p>
     <w:p>
       <w:pPr>
@@ -641,8 +645,6 @@
           </wp:inline>
         </w:drawing>
       </w:r>
-      <w:bookmarkStart w:id="0" w:name="_GoBack"/>
-      <w:bookmarkEnd w:id="0"/>
     </w:p>
     <w:sectPr>
       <w:headerReference w:type="default" r:id="rId12"/>

</xml_diff>